<commit_message>
test(e2e): scrub document metadata in the caret and selection fixtures
Core properties, tracked-change authors, template paths, and drawing
descriptions now carry neutral values.

Co-Authored-By: Claude Fable 5 <noreply@anthropic.com>
Claude-Session: https://claude.ai/code/session_01PxSJ2jB4RHdf5cDnf7Lk4F
</commit_message>
<xml_diff>
--- a/e2e/fixtures/lorem-caret-fix-check.docx
+++ b/e2e/fixtures/lorem-caret-fix-check.docx
@@ -26,7 +26,7 @@
             <wp:extent cx="7569200" cy="10702290"/>
             <wp:effectExtent l="0" t="0" r="0" b="0"/>
             <wp:wrapNone/>
-            <wp:docPr id="2" name="Bild 1" descr="Aktive Jobs:Aktive Jobs:Rohnke_Winter:28579_Rohnke_Winter_Kommunikationsauftritt:03_Kreation:03_Briefbogen:01_Layout:Doc:28579_03_Briefbogen_V04_RZ.pdf"/>
+            <wp:docPr id="2" name="Bild 1" descr="letterhead"/>
             <wp:cNvGraphicFramePr>
               <a:graphicFrameLocks xmlns:a="http://schemas.openxmlformats.org/drawingml/2006/main"/>
             </wp:cNvGraphicFramePr>
@@ -34,7 +34,7 @@
               <a:graphicData uri="http://schemas.openxmlformats.org/drawingml/2006/picture">
                 <pic:pic xmlns:pic="http://schemas.openxmlformats.org/drawingml/2006/picture">
                   <pic:nvPicPr>
-                    <pic:cNvPr id="0" name="Bild 1" descr="Aktive Jobs:Aktive Jobs:Rohnke_Winter:28579_Rohnke_Winter_Kommunikationsauftritt:03_Kreation:03_Briefbogen:01_Layout:Doc:28579_03_Briefbogen_V04_RZ.pdf"/>
+                    <pic:cNvPr id="0" name="Bild 1" descr="letterhead"/>
                     <pic:cNvPicPr>
                       <a:picLocks/>
                     </pic:cNvPicPr>
@@ -212,7 +212,7 @@
           <w:sz w:val="22"/>
           <w:szCs w:val="22"/>
           <w:lang w:val="en-US"/>
-          <w:rPrChange w:id="0" w:author="Jonathan Melke" w:date="2026-07-08T23:12:00Z" w16du:dateUtc="2026-07-08T21:12:00Z">
+          <w:rPrChange w:id="0" w:author="Ben Editor" w:date="2026-07-08T23:12:00Z" w16du:dateUtc="2026-07-08T21:12:00Z">
             <w:rPr>
               <w:rFonts w:ascii="Helvetica" w:hAnsi="Helvetica"/>
               <w:b/>
@@ -231,7 +231,7 @@
           <w:sz w:val="22"/>
           <w:szCs w:val="22"/>
           <w:lang w:val="en-US"/>
-          <w:rPrChange w:id="1" w:author="Jonathan Melke" w:date="2026-07-08T23:12:00Z" w16du:dateUtc="2026-07-08T21:12:00Z">
+          <w:rPrChange w:id="1" w:author="Ben Editor" w:date="2026-07-08T23:12:00Z" w16du:dateUtc="2026-07-08T21:12:00Z">
             <w:rPr>
               <w:rFonts w:ascii="Helvetica" w:hAnsi="Helvetica"/>
               <w:b/>
@@ -255,7 +255,7 @@
           <w:sz w:val="22"/>
           <w:szCs w:val="22"/>
           <w:lang w:val="en-US"/>
-          <w:rPrChange w:id="2" w:author="Jonathan Melke" w:date="2026-07-08T23:12:00Z" w16du:dateUtc="2026-07-08T21:12:00Z">
+          <w:rPrChange w:id="2" w:author="Ben Editor" w:date="2026-07-08T23:12:00Z" w16du:dateUtc="2026-07-08T21:12:00Z">
             <w:rPr>
               <w:rFonts w:ascii="Helvetica" w:hAnsi="Helvetica"/>
               <w:sz w:val="22"/>
@@ -278,7 +278,7 @@
           <w:sz w:val="22"/>
           <w:szCs w:val="22"/>
           <w:lang w:val="en-US"/>
-          <w:rPrChange w:id="3" w:author="Jonathan Melke" w:date="2026-07-08T23:12:00Z" w16du:dateUtc="2026-07-08T21:12:00Z">
+          <w:rPrChange w:id="3" w:author="Ben Editor" w:date="2026-07-08T23:12:00Z" w16du:dateUtc="2026-07-08T21:12:00Z">
             <w:rPr>
               <w:rFonts w:ascii="Helvetica" w:hAnsi="Helvetica"/>
               <w:sz w:val="22"/>
@@ -293,7 +293,7 @@
           <w:sz w:val="22"/>
           <w:szCs w:val="22"/>
           <w:lang w:val="en-US"/>
-          <w:rPrChange w:id="4" w:author="Jonathan Melke" w:date="2026-07-08T23:12:00Z" w16du:dateUtc="2026-07-08T21:12:00Z">
+          <w:rPrChange w:id="4" w:author="Ben Editor" w:date="2026-07-08T23:12:00Z" w16du:dateUtc="2026-07-08T21:12:00Z">
             <w:rPr>
               <w:rFonts w:ascii="Helvetica" w:hAnsi="Helvetica"/>
               <w:sz w:val="22"/>
@@ -317,7 +317,7 @@
           <w:sz w:val="22"/>
           <w:szCs w:val="22"/>
           <w:lang w:val="en-US"/>
-          <w:rPrChange w:id="5" w:author="Jonathan Melke" w:date="2026-07-08T23:12:00Z" w16du:dateUtc="2026-07-08T21:12:00Z">
+          <w:rPrChange w:id="5" w:author="Ben Editor" w:date="2026-07-08T23:12:00Z" w16du:dateUtc="2026-07-08T21:12:00Z">
             <w:rPr>
               <w:rFonts w:ascii="Helvetica" w:hAnsi="Helvetica"/>
               <w:sz w:val="22"/>
@@ -340,7 +340,7 @@
           <w:sz w:val="22"/>
           <w:szCs w:val="22"/>
           <w:lang w:val="en-US"/>
-          <w:rPrChange w:id="6" w:author="Jonathan Melke" w:date="2026-07-08T23:12:00Z" w16du:dateUtc="2026-07-08T21:12:00Z">
+          <w:rPrChange w:id="6" w:author="Ben Editor" w:date="2026-07-08T23:12:00Z" w16du:dateUtc="2026-07-08T21:12:00Z">
             <w:rPr>
               <w:rFonts w:ascii="Helvetica" w:hAnsi="Helvetica"/>
               <w:sz w:val="22"/>
@@ -355,7 +355,7 @@
           <w:sz w:val="22"/>
           <w:szCs w:val="22"/>
           <w:lang w:val="en-US"/>
-          <w:rPrChange w:id="7" w:author="Jonathan Melke" w:date="2026-07-08T23:12:00Z" w16du:dateUtc="2026-07-08T21:12:00Z">
+          <w:rPrChange w:id="7" w:author="Ben Editor" w:date="2026-07-08T23:12:00Z" w16du:dateUtc="2026-07-08T21:12:00Z">
             <w:rPr>
               <w:rFonts w:ascii="Helvetica" w:hAnsi="Helvetica"/>
               <w:sz w:val="22"/>
@@ -379,7 +379,7 @@
           <w:sz w:val="22"/>
           <w:szCs w:val="22"/>
           <w:lang w:val="en-US"/>
-          <w:rPrChange w:id="8" w:author="Jonathan Melke" w:date="2026-07-08T23:12:00Z" w16du:dateUtc="2026-07-08T21:12:00Z">
+          <w:rPrChange w:id="8" w:author="Ben Editor" w:date="2026-07-08T23:12:00Z" w16du:dateUtc="2026-07-08T21:12:00Z">
             <w:rPr>
               <w:rFonts w:ascii="Helvetica" w:hAnsi="Helvetica"/>
               <w:sz w:val="22"/>
@@ -402,7 +402,7 @@
           <w:sz w:val="22"/>
           <w:szCs w:val="22"/>
           <w:lang w:val="en-US"/>
-          <w:rPrChange w:id="9" w:author="Jonathan Melke" w:date="2026-07-08T23:12:00Z" w16du:dateUtc="2026-07-08T21:12:00Z">
+          <w:rPrChange w:id="9" w:author="Ben Editor" w:date="2026-07-08T23:12:00Z" w16du:dateUtc="2026-07-08T21:12:00Z">
             <w:rPr>
               <w:rFonts w:ascii="Helvetica" w:hAnsi="Helvetica"/>
               <w:sz w:val="22"/>
@@ -417,7 +417,7 @@
           <w:sz w:val="22"/>
           <w:szCs w:val="22"/>
           <w:lang w:val="en-US"/>
-          <w:rPrChange w:id="10" w:author="Jonathan Melke" w:date="2026-07-08T23:12:00Z" w16du:dateUtc="2026-07-08T21:12:00Z">
+          <w:rPrChange w:id="10" w:author="Ben Editor" w:date="2026-07-08T23:12:00Z" w16du:dateUtc="2026-07-08T21:12:00Z">
             <w:rPr>
               <w:rFonts w:ascii="Helvetica" w:hAnsi="Helvetica"/>
               <w:sz w:val="22"/>
@@ -441,7 +441,7 @@
           <w:sz w:val="22"/>
           <w:szCs w:val="22"/>
           <w:lang w:val="en-US"/>
-          <w:rPrChange w:id="11" w:author="Jonathan Melke" w:date="2026-07-08T23:12:00Z" w16du:dateUtc="2026-07-08T21:12:00Z">
+          <w:rPrChange w:id="11" w:author="Ben Editor" w:date="2026-07-08T23:12:00Z" w16du:dateUtc="2026-07-08T21:12:00Z">
             <w:rPr>
               <w:rFonts w:ascii="Helvetica" w:hAnsi="Helvetica"/>
               <w:sz w:val="22"/>
@@ -464,7 +464,7 @@
           <w:sz w:val="22"/>
           <w:szCs w:val="22"/>
           <w:lang w:val="en-US"/>
-          <w:rPrChange w:id="12" w:author="Jonathan Melke" w:date="2026-07-08T23:12:00Z" w16du:dateUtc="2026-07-08T21:12:00Z">
+          <w:rPrChange w:id="12" w:author="Ben Editor" w:date="2026-07-08T23:12:00Z" w16du:dateUtc="2026-07-08T21:12:00Z">
             <w:rPr>
               <w:rFonts w:ascii="Helvetica" w:hAnsi="Helvetica"/>
               <w:sz w:val="22"/>
@@ -479,7 +479,7 @@
           <w:sz w:val="22"/>
           <w:szCs w:val="22"/>
           <w:lang w:val="en-US"/>
-          <w:rPrChange w:id="13" w:author="Jonathan Melke" w:date="2026-07-08T23:12:00Z" w16du:dateUtc="2026-07-08T21:12:00Z">
+          <w:rPrChange w:id="13" w:author="Ben Editor" w:date="2026-07-08T23:12:00Z" w16du:dateUtc="2026-07-08T21:12:00Z">
             <w:rPr>
               <w:rFonts w:ascii="Helvetica" w:hAnsi="Helvetica"/>
               <w:sz w:val="22"/>
@@ -503,7 +503,7 @@
           <w:sz w:val="22"/>
           <w:szCs w:val="22"/>
           <w:lang w:val="en-US"/>
-          <w:rPrChange w:id="14" w:author="Jonathan Melke" w:date="2026-07-08T23:12:00Z" w16du:dateUtc="2026-07-08T21:12:00Z">
+          <w:rPrChange w:id="14" w:author="Ben Editor" w:date="2026-07-08T23:12:00Z" w16du:dateUtc="2026-07-08T21:12:00Z">
             <w:rPr>
               <w:rFonts w:ascii="Helvetica" w:hAnsi="Helvetica"/>
               <w:sz w:val="22"/>
@@ -526,7 +526,7 @@
           <w:sz w:val="22"/>
           <w:szCs w:val="22"/>
           <w:lang w:val="en-US"/>
-          <w:rPrChange w:id="15" w:author="Jonathan Melke" w:date="2026-07-08T23:12:00Z" w16du:dateUtc="2026-07-08T21:12:00Z">
+          <w:rPrChange w:id="15" w:author="Ben Editor" w:date="2026-07-08T23:12:00Z" w16du:dateUtc="2026-07-08T21:12:00Z">
             <w:rPr>
               <w:rFonts w:ascii="Helvetica" w:hAnsi="Helvetica"/>
               <w:sz w:val="22"/>
@@ -541,7 +541,7 @@
           <w:sz w:val="22"/>
           <w:szCs w:val="22"/>
           <w:lang w:val="en-US"/>
-          <w:rPrChange w:id="16" w:author="Jonathan Melke" w:date="2026-07-08T23:12:00Z" w16du:dateUtc="2026-07-08T21:12:00Z">
+          <w:rPrChange w:id="16" w:author="Ben Editor" w:date="2026-07-08T23:12:00Z" w16du:dateUtc="2026-07-08T21:12:00Z">
             <w:rPr>
               <w:rFonts w:ascii="Helvetica" w:hAnsi="Helvetica"/>
               <w:sz w:val="22"/>
@@ -562,7 +562,7 @@
           <w:sz w:val="24"/>
           <w:szCs w:val="24"/>
           <w:lang w:val="en-US"/>
-          <w:rPrChange w:id="17" w:author="Jonathan Melke" w:date="2026-07-08T23:12:00Z" w16du:dateUtc="2026-07-08T21:12:00Z">
+          <w:rPrChange w:id="17" w:author="Ben Editor" w:date="2026-07-08T23:12:00Z" w16du:dateUtc="2026-07-08T21:12:00Z">
             <w:rPr>
               <w:sz w:val="24"/>
               <w:szCs w:val="24"/>
@@ -584,7 +584,7 @@
           <w:sz w:val="22"/>
           <w:szCs w:val="22"/>
           <w:lang w:val="en-US"/>
-          <w:rPrChange w:id="18" w:author="Jonathan Melke" w:date="2026-07-08T23:12:00Z" w16du:dateUtc="2026-07-08T21:12:00Z">
+          <w:rPrChange w:id="18" w:author="Ben Editor" w:date="2026-07-08T23:12:00Z" w16du:dateUtc="2026-07-08T21:12:00Z">
             <w:rPr>
               <w:rFonts w:ascii="Helvetica" w:hAnsi="Helvetica"/>
               <w:sz w:val="22"/>
@@ -600,7 +600,7 @@
           <w:sz w:val="22"/>
           <w:szCs w:val="22"/>
           <w:lang w:val="en-US"/>
-          <w:rPrChange w:id="20" w:author="Jonathan Melke" w:date="2026-07-08T23:12:00Z" w16du:dateUtc="2026-07-08T21:12:00Z">
+          <w:rPrChange w:id="20" w:author="Ben Editor" w:date="2026-07-08T23:12:00Z" w16du:dateUtc="2026-07-08T21:12:00Z">
             <w:rPr>
               <w:rFonts w:ascii="Helvetica" w:hAnsi="Helvetica"/>
               <w:sz w:val="22"/>
@@ -611,7 +611,7 @@
         <w:tab/>
         <w:t xml:space="preserve">mag ali </w:t>
       </w:r>
-      <w:ins w:id="21" w:author="Jonathan Melke" w:date="2026-07-08T23:12:00Z" w16du:dateUtc="2026-07-08T21:12:00Z">
+      <w:ins w:id="21" w:author="Ben Editor" w:date="2026-07-08T23:12:00Z" w16du:dateUtc="2026-07-08T21:12:00Z">
         <w:r>
           <w:rPr>
             <w:rFonts w:ascii="Helvetica" w:hAnsi="Helvetica"/>
@@ -628,7 +628,7 @@
           <w:sz w:val="22"/>
           <w:szCs w:val="22"/>
           <w:lang w:val="en-US"/>
-          <w:rPrChange w:id="22" w:author="Jonathan Melke" w:date="2026-07-08T23:12:00Z" w16du:dateUtc="2026-07-08T21:12:00Z">
+          <w:rPrChange w:id="22" w:author="Ben Editor" w:date="2026-07-08T23:12:00Z" w16du:dateUtc="2026-07-08T21:12:00Z">
             <w:rPr>
               <w:rFonts w:ascii="Helvetica" w:hAnsi="Helvetica"/>
               <w:sz w:val="22"/>
@@ -644,7 +644,7 @@
           <w:sz w:val="22"/>
           <w:szCs w:val="22"/>
           <w:lang w:val="en-US"/>
-          <w:rPrChange w:id="23" w:author="Jonathan Melke" w:date="2026-07-08T23:12:00Z" w16du:dateUtc="2026-07-08T21:12:00Z">
+          <w:rPrChange w:id="23" w:author="Ben Editor" w:date="2026-07-08T23:12:00Z" w16du:dateUtc="2026-07-08T21:12:00Z">
             <w:rPr>
               <w:rFonts w:ascii="Helvetica" w:hAnsi="Helvetica"/>
               <w:sz w:val="22"/>
@@ -660,7 +660,7 @@
           <w:sz w:val="22"/>
           <w:szCs w:val="22"/>
           <w:lang w:val="en-US"/>
-          <w:rPrChange w:id="24" w:author="Jonathan Melke" w:date="2026-07-08T23:12:00Z" w16du:dateUtc="2026-07-08T21:12:00Z">
+          <w:rPrChange w:id="24" w:author="Ben Editor" w:date="2026-07-08T23:12:00Z" w16du:dateUtc="2026-07-08T21:12:00Z">
             <w:rPr>
               <w:rFonts w:ascii="Helvetica" w:hAnsi="Helvetica"/>
               <w:sz w:val="22"/>
@@ -676,7 +676,7 @@
           <w:sz w:val="22"/>
           <w:szCs w:val="22"/>
           <w:lang w:val="en-US"/>
-          <w:rPrChange w:id="25" w:author="Jonathan Melke" w:date="2026-07-08T23:12:00Z" w16du:dateUtc="2026-07-08T21:12:00Z">
+          <w:rPrChange w:id="25" w:author="Ben Editor" w:date="2026-07-08T23:12:00Z" w16du:dateUtc="2026-07-08T21:12:00Z">
             <w:rPr>
               <w:rFonts w:ascii="Helvetica" w:hAnsi="Helvetica"/>
               <w:sz w:val="22"/>
@@ -686,14 +686,14 @@
         </w:rPr>
         <w:t xml:space="preserve">nos Exercitati ull laborisni Aliquipexeacommodoconse </w:t>
       </w:r>
-      <w:del w:id="26" w:author="Jonathan Melke" w:date="2026-07-08T23:12:00Z" w16du:dateUtc="2026-07-08T21:12:00Z">
+      <w:del w:id="26" w:author="Ben Editor" w:date="2026-07-08T23:12:00Z" w16du:dateUtc="2026-07-08T21:12:00Z">
         <w:r>
           <w:rPr>
             <w:rFonts w:ascii="Helvetica" w:hAnsi="Helvetica"/>
             <w:sz w:val="22"/>
             <w:szCs w:val="22"/>
             <w:lang w:val="en-US"/>
-            <w:rPrChange w:id="27" w:author="Jonathan Melke" w:date="2026-07-08T23:12:00Z" w16du:dateUtc="2026-07-08T21:12:00Z">
+            <w:rPrChange w:id="27" w:author="Ben Editor" w:date="2026-07-08T23:12:00Z" w16du:dateUtc="2026-07-08T21:12:00Z">
               <w:rPr>
                 <w:rFonts w:ascii="Helvetica" w:hAnsi="Helvetica"/>
                 <w:sz w:val="22"/>
@@ -709,7 +709,7 @@
             <w:sz w:val="22"/>
             <w:szCs w:val="22"/>
             <w:lang w:val="en-US"/>
-            <w:rPrChange w:id="28" w:author="Jonathan Melke" w:date="2026-07-08T23:12:00Z" w16du:dateUtc="2026-07-08T21:12:00Z">
+            <w:rPrChange w:id="28" w:author="Ben Editor" w:date="2026-07-08T23:12:00Z" w16du:dateUtc="2026-07-08T21:12:00Z">
               <w:rPr>
                 <w:rFonts w:ascii="Helvetica" w:hAnsi="Helvetica"/>
                 <w:sz w:val="22"/>
@@ -725,7 +725,7 @@
             <w:sz w:val="22"/>
             <w:szCs w:val="22"/>
             <w:lang w:val="en-US"/>
-            <w:rPrChange w:id="29" w:author="Jonathan Melke" w:date="2026-07-08T23:12:00Z" w16du:dateUtc="2026-07-08T21:12:00Z">
+            <w:rPrChange w:id="29" w:author="Ben Editor" w:date="2026-07-08T23:12:00Z" w16du:dateUtc="2026-07-08T21:12:00Z">
               <w:rPr>
                 <w:rFonts w:ascii="Helvetica" w:hAnsi="Helvetica"/>
                 <w:sz w:val="22"/>
@@ -742,7 +742,7 @@
           <w:sz w:val="22"/>
           <w:szCs w:val="22"/>
           <w:lang w:val="en-US"/>
-          <w:rPrChange w:id="30" w:author="Jonathan Melke" w:date="2026-07-08T23:12:00Z" w16du:dateUtc="2026-07-08T21:12:00Z">
+          <w:rPrChange w:id="30" w:author="Ben Editor" w:date="2026-07-08T23:12:00Z" w16du:dateUtc="2026-07-08T21:12:00Z">
             <w:rPr>
               <w:rFonts w:ascii="Helvetica" w:hAnsi="Helvetica"/>
               <w:sz w:val="22"/>
@@ -752,7 +752,7 @@
         </w:rPr>
         <w:t xml:space="preserve">adipiscingel Seddoeiusmodte Incididuntutlaboreetdo mag </w:t>
       </w:r>
-      <w:ins w:id="31" w:author="Jonathan Melke" w:date="2026-07-08T23:12:00Z" w16du:dateUtc="2026-07-08T21:12:00Z">
+      <w:ins w:id="31" w:author="Ben Editor" w:date="2026-07-08T23:12:00Z" w16du:dateUtc="2026-07-08T21:12:00Z">
         <w:r>
           <w:rPr>
             <w:rFonts w:ascii="Helvetica" w:hAnsi="Helvetica"/>
@@ -769,7 +769,7 @@
           <w:sz w:val="22"/>
           <w:szCs w:val="22"/>
           <w:lang w:val="en-US"/>
-          <w:rPrChange w:id="32" w:author="Jonathan Melke" w:date="2026-07-08T23:12:00Z" w16du:dateUtc="2026-07-08T21:12:00Z">
+          <w:rPrChange w:id="32" w:author="Ben Editor" w:date="2026-07-08T23:12:00Z" w16du:dateUtc="2026-07-08T21:12:00Z">
             <w:rPr>
               <w:rFonts w:ascii="Helvetica" w:hAnsi="Helvetica"/>
               <w:sz w:val="22"/>
@@ -787,7 +787,7 @@
           <w:sz w:val="22"/>
           <w:szCs w:val="22"/>
           <w:lang w:val="en-US"/>
-          <w:rPrChange w:id="33" w:author="Jonathan Melke" w:date="2026-07-08T23:12:00Z" w16du:dateUtc="2026-07-08T21:12:00Z">
+          <w:rPrChange w:id="33" w:author="Ben Editor" w:date="2026-07-08T23:12:00Z" w16du:dateUtc="2026-07-08T21:12:00Z">
             <w:rPr>
               <w:rStyle w:val="CommentReference"/>
               <w:rFonts w:ascii="Helvetica" w:hAnsi="Helvetica"/>
@@ -812,7 +812,7 @@
           <w:sz w:val="22"/>
           <w:szCs w:val="22"/>
           <w:lang w:val="en-US"/>
-          <w:rPrChange w:id="34" w:author="Jonathan Melke" w:date="2026-07-08T23:12:00Z" w16du:dateUtc="2026-07-08T21:12:00Z">
+          <w:rPrChange w:id="34" w:author="Ben Editor" w:date="2026-07-08T23:12:00Z" w16du:dateUtc="2026-07-08T21:12:00Z">
             <w:rPr>
               <w:rFonts w:ascii="Helvetica" w:hAnsi="Helvetica"/>
               <w:sz w:val="22"/>
@@ -835,7 +835,7 @@
           <w:sz w:val="22"/>
           <w:szCs w:val="22"/>
           <w:lang w:val="en-US"/>
-          <w:rPrChange w:id="35" w:author="Jonathan Melke" w:date="2026-07-08T23:12:00Z" w16du:dateUtc="2026-07-08T21:12:00Z">
+          <w:rPrChange w:id="35" w:author="Ben Editor" w:date="2026-07-08T23:12:00Z" w16du:dateUtc="2026-07-08T21:12:00Z">
             <w:rPr>
               <w:rFonts w:ascii="Helvetica" w:hAnsi="Helvetica"/>
               <w:sz w:val="22"/>
@@ -850,7 +850,7 @@
           <w:sz w:val="22"/>
           <w:szCs w:val="22"/>
           <w:lang w:val="en-US"/>
-          <w:rPrChange w:id="36" w:author="Jonathan Melke" w:date="2026-07-08T23:12:00Z" w16du:dateUtc="2026-07-08T21:12:00Z">
+          <w:rPrChange w:id="36" w:author="Ben Editor" w:date="2026-07-08T23:12:00Z" w16du:dateUtc="2026-07-08T21:12:00Z">
             <w:rPr>
               <w:rFonts w:ascii="Helvetica" w:hAnsi="Helvetica"/>
               <w:sz w:val="22"/>
@@ -866,7 +866,7 @@
           <w:sz w:val="22"/>
           <w:szCs w:val="22"/>
           <w:lang w:val="en-US"/>
-          <w:rPrChange w:id="37" w:author="Jonathan Melke" w:date="2026-07-08T23:12:00Z" w16du:dateUtc="2026-07-08T21:12:00Z">
+          <w:rPrChange w:id="37" w:author="Ben Editor" w:date="2026-07-08T23:12:00Z" w16du:dateUtc="2026-07-08T21:12:00Z">
             <w:rPr>
               <w:rFonts w:ascii="Helvetica" w:hAnsi="Helvetica"/>
               <w:sz w:val="22"/>
@@ -877,7 +877,7 @@
         <w:tab/>
         <w:t>Nostrudexercitationull laborisni aliqu e eac Con du aute Irurein Rep voluptateve Essecillumeufug nullapa exc sin Occaeca cup Nonproi su cul qui Officiad mollitanim ide lab lor</w:t>
       </w:r>
-      <w:ins w:id="38" w:author="Jonathan Melke" w:date="2026-07-08T23:12:00Z" w16du:dateUtc="2026-07-08T21:12:00Z">
+      <w:ins w:id="38" w:author="Ben Editor" w:date="2026-07-08T23:12:00Z" w16du:dateUtc="2026-07-08T21:12:00Z">
         <w:r>
           <w:rPr>
             <w:rFonts w:ascii="Helvetica" w:hAnsi="Helvetica"/>
@@ -993,7 +993,7 @@
           <w:sz w:val="22"/>
           <w:szCs w:val="22"/>
           <w:lang w:val="en-US"/>
-          <w:rPrChange w:id="39" w:author="Jonathan Melke" w:date="2026-07-08T23:12:00Z" w16du:dateUtc="2026-07-08T21:12:00Z">
+          <w:rPrChange w:id="39" w:author="Ben Editor" w:date="2026-07-08T23:12:00Z" w16du:dateUtc="2026-07-08T21:12:00Z">
             <w:rPr>
               <w:rFonts w:ascii="Helvetica" w:hAnsi="Helvetica"/>
               <w:sz w:val="22"/>
@@ -1009,7 +1009,7 @@
           <w:sz w:val="22"/>
           <w:szCs w:val="22"/>
           <w:lang w:val="en-US"/>
-          <w:rPrChange w:id="40" w:author="Jonathan Melke" w:date="2026-07-08T23:12:00Z" w16du:dateUtc="2026-07-08T21:12:00Z">
+          <w:rPrChange w:id="40" w:author="Ben Editor" w:date="2026-07-08T23:12:00Z" w16du:dateUtc="2026-07-08T21:12:00Z">
             <w:rPr>
               <w:rFonts w:ascii="Helvetica" w:hAnsi="Helvetica"/>
               <w:sz w:val="22"/>
@@ -1025,7 +1025,7 @@
           <w:sz w:val="22"/>
           <w:szCs w:val="22"/>
           <w:lang w:val="en-US"/>
-          <w:rPrChange w:id="41" w:author="Jonathan Melke" w:date="2026-07-08T23:12:00Z" w16du:dateUtc="2026-07-08T21:12:00Z">
+          <w:rPrChange w:id="41" w:author="Ben Editor" w:date="2026-07-08T23:12:00Z" w16du:dateUtc="2026-07-08T21:12:00Z">
             <w:rPr>
               <w:rFonts w:ascii="Helvetica" w:hAnsi="Helvetica"/>
               <w:sz w:val="22"/>
@@ -1041,7 +1041,7 @@
           <w:sz w:val="22"/>
           <w:szCs w:val="22"/>
           <w:lang w:val="en-US"/>
-          <w:rPrChange w:id="42" w:author="Jonathan Melke" w:date="2026-07-08T23:12:00Z" w16du:dateUtc="2026-07-08T21:12:00Z">
+          <w:rPrChange w:id="42" w:author="Ben Editor" w:date="2026-07-08T23:12:00Z" w16du:dateUtc="2026-07-08T21:12:00Z">
             <w:rPr>
               <w:rFonts w:ascii="Helvetica" w:hAnsi="Helvetica"/>
               <w:sz w:val="22"/>
@@ -1066,7 +1066,7 @@
           <w:sz w:val="22"/>
           <w:szCs w:val="22"/>
           <w:lang w:val="en-US"/>
-          <w:rPrChange w:id="43" w:author="Jonathan Melke" w:date="2026-07-08T23:12:00Z" w16du:dateUtc="2026-07-08T21:12:00Z">
+          <w:rPrChange w:id="43" w:author="Ben Editor" w:date="2026-07-08T23:12:00Z" w16du:dateUtc="2026-07-08T21:12:00Z">
             <w:rPr>
               <w:rFonts w:ascii="Helvetica" w:hAnsi="Helvetica"/>
               <w:sz w:val="22"/>
@@ -1089,7 +1089,7 @@
           <w:sz w:val="22"/>
           <w:szCs w:val="22"/>
           <w:lang w:val="en-US"/>
-          <w:rPrChange w:id="44" w:author="Jonathan Melke" w:date="2026-07-08T23:12:00Z" w16du:dateUtc="2026-07-08T21:12:00Z">
+          <w:rPrChange w:id="44" w:author="Ben Editor" w:date="2026-07-08T23:12:00Z" w16du:dateUtc="2026-07-08T21:12:00Z">
             <w:rPr>
               <w:rFonts w:ascii="Helvetica" w:hAnsi="Helvetica"/>
               <w:sz w:val="22"/>
@@ -1104,7 +1104,7 @@
           <w:sz w:val="22"/>
           <w:szCs w:val="22"/>
           <w:lang w:val="en-US"/>
-          <w:rPrChange w:id="45" w:author="Jonathan Melke" w:date="2026-07-08T23:12:00Z" w16du:dateUtc="2026-07-08T21:12:00Z">
+          <w:rPrChange w:id="45" w:author="Ben Editor" w:date="2026-07-08T23:12:00Z" w16du:dateUtc="2026-07-08T21:12:00Z">
             <w:rPr>
               <w:rFonts w:ascii="Helvetica" w:hAnsi="Helvetica"/>
               <w:sz w:val="22"/>
@@ -1120,7 +1120,7 @@
           <w:sz w:val="22"/>
           <w:szCs w:val="22"/>
           <w:lang w:val="en-US"/>
-          <w:rPrChange w:id="46" w:author="Jonathan Melke" w:date="2026-07-08T23:12:00Z" w16du:dateUtc="2026-07-08T21:12:00Z">
+          <w:rPrChange w:id="46" w:author="Ben Editor" w:date="2026-07-08T23:12:00Z" w16du:dateUtc="2026-07-08T21:12:00Z">
             <w:rPr>
               <w:rFonts w:ascii="Helvetica" w:hAnsi="Helvetica"/>
               <w:sz w:val="22"/>
@@ -1138,7 +1138,7 @@
           <w:sz w:val="22"/>
           <w:szCs w:val="22"/>
           <w:lang w:val="en-US"/>
-          <w:rPrChange w:id="47" w:author="Jonathan Melke" w:date="2026-07-08T23:12:00Z" w16du:dateUtc="2026-07-08T21:12:00Z">
+          <w:rPrChange w:id="47" w:author="Ben Editor" w:date="2026-07-08T23:12:00Z" w16du:dateUtc="2026-07-08T21:12:00Z">
             <w:rPr>
               <w:rFonts w:ascii="Helvetica" w:hAnsi="Helvetica"/>
               <w:i/>
@@ -1156,7 +1156,7 @@
           <w:sz w:val="22"/>
           <w:szCs w:val="22"/>
           <w:lang w:val="en-US"/>
-          <w:rPrChange w:id="48" w:author="Jonathan Melke" w:date="2026-07-08T23:12:00Z" w16du:dateUtc="2026-07-08T21:12:00Z">
+          <w:rPrChange w:id="48" w:author="Ben Editor" w:date="2026-07-08T23:12:00Z" w16du:dateUtc="2026-07-08T21:12:00Z">
             <w:rPr>
               <w:rFonts w:ascii="Helvetica" w:hAnsi="Helvetica"/>
               <w:sz w:val="22"/>
@@ -1172,7 +1172,7 @@
           <w:sz w:val="22"/>
           <w:szCs w:val="22"/>
           <w:lang w:val="en-US"/>
-          <w:rPrChange w:id="49" w:author="Jonathan Melke" w:date="2026-07-08T23:12:00Z" w16du:dateUtc="2026-07-08T21:12:00Z">
+          <w:rPrChange w:id="49" w:author="Ben Editor" w:date="2026-07-08T23:12:00Z" w16du:dateUtc="2026-07-08T21:12:00Z">
             <w:rPr>
               <w:rFonts w:ascii="Helvetica" w:hAnsi="Helvetica"/>
               <w:sz w:val="22"/>
@@ -1188,7 +1188,7 @@
           <w:sz w:val="22"/>
           <w:szCs w:val="22"/>
           <w:lang w:val="en-US"/>
-          <w:rPrChange w:id="50" w:author="Jonathan Melke" w:date="2026-07-08T23:12:00Z" w16du:dateUtc="2026-07-08T21:12:00Z">
+          <w:rPrChange w:id="50" w:author="Ben Editor" w:date="2026-07-08T23:12:00Z" w16du:dateUtc="2026-07-08T21:12:00Z">
             <w:rPr>
               <w:rFonts w:ascii="Helvetica" w:hAnsi="Helvetica"/>
               <w:sz w:val="22"/>
@@ -1206,7 +1206,7 @@
           <w:sz w:val="22"/>
           <w:szCs w:val="22"/>
           <w:lang w:val="en-US"/>
-          <w:rPrChange w:id="51" w:author="Jonathan Melke" w:date="2026-07-08T23:12:00Z" w16du:dateUtc="2026-07-08T21:12:00Z">
+          <w:rPrChange w:id="51" w:author="Ben Editor" w:date="2026-07-08T23:12:00Z" w16du:dateUtc="2026-07-08T21:12:00Z">
             <w:rPr>
               <w:rFonts w:ascii="Helvetica" w:hAnsi="Helvetica"/>
               <w:i/>
@@ -1224,7 +1224,7 @@
           <w:sz w:val="22"/>
           <w:szCs w:val="22"/>
           <w:lang w:val="en-US"/>
-          <w:rPrChange w:id="52" w:author="Jonathan Melke" w:date="2026-07-08T23:12:00Z" w16du:dateUtc="2026-07-08T21:12:00Z">
+          <w:rPrChange w:id="52" w:author="Ben Editor" w:date="2026-07-08T23:12:00Z" w16du:dateUtc="2026-07-08T21:12:00Z">
             <w:rPr>
               <w:rFonts w:ascii="Helvetica" w:hAnsi="Helvetica"/>
               <w:sz w:val="22"/>
@@ -1240,7 +1240,7 @@
           <w:sz w:val="22"/>
           <w:szCs w:val="22"/>
           <w:lang w:val="en-US"/>
-          <w:rPrChange w:id="53" w:author="Jonathan Melke" w:date="2026-07-08T23:12:00Z" w16du:dateUtc="2026-07-08T21:12:00Z">
+          <w:rPrChange w:id="53" w:author="Ben Editor" w:date="2026-07-08T23:12:00Z" w16du:dateUtc="2026-07-08T21:12:00Z">
             <w:rPr>
               <w:rFonts w:ascii="Helvetica" w:hAnsi="Helvetica"/>
               <w:sz w:val="22"/>
@@ -1264,7 +1264,7 @@
           <w:sz w:val="22"/>
           <w:szCs w:val="22"/>
           <w:lang w:val="en-US"/>
-          <w:rPrChange w:id="54" w:author="Jonathan Melke" w:date="2026-07-08T23:12:00Z" w16du:dateUtc="2026-07-08T21:12:00Z">
+          <w:rPrChange w:id="54" w:author="Ben Editor" w:date="2026-07-08T23:12:00Z" w16du:dateUtc="2026-07-08T21:12:00Z">
             <w:rPr>
               <w:rFonts w:ascii="Helvetica" w:hAnsi="Helvetica"/>
               <w:sz w:val="22"/>
@@ -1287,7 +1287,7 @@
           <w:sz w:val="22"/>
           <w:szCs w:val="22"/>
           <w:lang w:val="en-US"/>
-          <w:rPrChange w:id="55" w:author="Jonathan Melke" w:date="2026-07-08T23:12:00Z" w16du:dateUtc="2026-07-08T21:12:00Z">
+          <w:rPrChange w:id="55" w:author="Ben Editor" w:date="2026-07-08T23:12:00Z" w16du:dateUtc="2026-07-08T21:12:00Z">
             <w:rPr>
               <w:rFonts w:ascii="Helvetica" w:hAnsi="Helvetica"/>
               <w:sz w:val="22"/>
@@ -1302,7 +1302,7 @@
           <w:sz w:val="22"/>
           <w:szCs w:val="22"/>
           <w:lang w:val="en-US"/>
-          <w:rPrChange w:id="56" w:author="Jonathan Melke" w:date="2026-07-08T23:12:00Z" w16du:dateUtc="2026-07-08T21:12:00Z">
+          <w:rPrChange w:id="56" w:author="Ben Editor" w:date="2026-07-08T23:12:00Z" w16du:dateUtc="2026-07-08T21:12:00Z">
             <w:rPr>
               <w:rFonts w:ascii="Helvetica" w:hAnsi="Helvetica"/>
               <w:sz w:val="22"/>
@@ -1318,7 +1318,7 @@
           <w:sz w:val="22"/>
           <w:szCs w:val="22"/>
           <w:lang w:val="en-US"/>
-          <w:rPrChange w:id="57" w:author="Jonathan Melke" w:date="2026-07-08T23:12:00Z" w16du:dateUtc="2026-07-08T21:12:00Z">
+          <w:rPrChange w:id="57" w:author="Ben Editor" w:date="2026-07-08T23:12:00Z" w16du:dateUtc="2026-07-08T21:12:00Z">
             <w:rPr>
               <w:rFonts w:ascii="Helvetica" w:hAnsi="Helvetica"/>
               <w:sz w:val="22"/>
@@ -1335,7 +1335,7 @@
           <w:sz w:val="22"/>
           <w:szCs w:val="22"/>
           <w:lang w:val="en-US"/>
-          <w:rPrChange w:id="58" w:author="Jonathan Melke" w:date="2026-07-08T23:12:00Z" w16du:dateUtc="2026-07-08T21:12:00Z">
+          <w:rPrChange w:id="58" w:author="Ben Editor" w:date="2026-07-08T23:12:00Z" w16du:dateUtc="2026-07-08T21:12:00Z">
             <w:rPr>
               <w:rFonts w:ascii="Helvetica" w:hAnsi="Helvetica"/>
               <w:sz w:val="22"/>
@@ -1351,7 +1351,7 @@
           <w:sz w:val="22"/>
           <w:szCs w:val="22"/>
           <w:lang w:val="en-US"/>
-          <w:rPrChange w:id="59" w:author="Jonathan Melke" w:date="2026-07-08T23:12:00Z" w16du:dateUtc="2026-07-08T21:12:00Z">
+          <w:rPrChange w:id="59" w:author="Ben Editor" w:date="2026-07-08T23:12:00Z" w16du:dateUtc="2026-07-08T21:12:00Z">
             <w:rPr>
               <w:rFonts w:ascii="Helvetica" w:hAnsi="Helvetica"/>
               <w:sz w:val="22"/>
@@ -1375,7 +1375,7 @@
           <w:sz w:val="22"/>
           <w:szCs w:val="22"/>
           <w:lang w:val="en-US"/>
-          <w:rPrChange w:id="60" w:author="Jonathan Melke" w:date="2026-07-08T23:12:00Z" w16du:dateUtc="2026-07-08T21:12:00Z">
+          <w:rPrChange w:id="60" w:author="Ben Editor" w:date="2026-07-08T23:12:00Z" w16du:dateUtc="2026-07-08T21:12:00Z">
             <w:rPr>
               <w:rFonts w:ascii="Helvetica" w:hAnsi="Helvetica"/>
               <w:sz w:val="22"/>
@@ -3767,7 +3767,7 @@
 
 <file path=word/comments.xml><?xml version="1.0" encoding="utf-8"?>
 <w:comments xmlns:wpc="http://schemas.microsoft.com/office/word/2010/wordprocessingCanvas" xmlns:cx="http://schemas.microsoft.com/office/drawing/2014/chartex" xmlns:cx1="http://schemas.microsoft.com/office/drawing/2015/9/8/chartex" xmlns:cx2="http://schemas.microsoft.com/office/drawing/2015/10/21/chartex" xmlns:cx3="http://schemas.microsoft.com/office/drawing/2016/5/9/chartex" xmlns:cx4="http://schemas.microsoft.com/office/drawing/2016/5/10/chartex" xmlns:cx5="http://schemas.microsoft.com/office/drawing/2016/5/11/chartex" xmlns:cx6="http://schemas.microsoft.com/office/drawing/2016/5/12/chartex" xmlns:cx7="http://schemas.microsoft.com/office/drawing/2016/5/13/chartex" xmlns:cx8="http://schemas.microsoft.com/office/drawing/2016/5/14/chartex" xmlns:mc="http://schemas.openxmlformats.org/markup-compatibility/2006" xmlns:aink="http://schemas.microsoft.com/office/drawing/2016/ink" xmlns:am3d="http://schemas.microsoft.com/office/drawing/2017/model3d" xmlns:o="urn:schemas-microsoft-com:office:office" xmlns:oel="http://schemas.microsoft.com/office/2019/extlst" xmlns:r="http://schemas.openxmlformats.org/officeDocument/2006/relationships" xmlns:m="http://schemas.openxmlformats.org/officeDocument/2006/math" xmlns:v="urn:schemas-microsoft-com:vml" xmlns:wp14="http://schemas.microsoft.com/office/word/2010/wordprocessingDrawing" xmlns:wp="http://schemas.openxmlformats.org/drawingml/2006/wordprocessingDrawing" xmlns:w10="urn:schemas-microsoft-com:office:word" xmlns:w="http://schemas.openxmlformats.org/wordprocessingml/2006/main" xmlns:w14="http://schemas.microsoft.com/office/word/2010/wordml" xmlns:w15="http://schemas.microsoft.com/office/word/2012/wordml" xmlns:w16cex="http://schemas.microsoft.com/office/word/2018/wordml/cex" xmlns:w16cid="http://schemas.microsoft.com/office/word/2016/wordml/cid" xmlns:w16="http://schemas.microsoft.com/office/word/2018/wordml" xmlns:w16du="http://schemas.microsoft.com/office/word/2023/wordml/word16du" xmlns:w16sdtdh="http://schemas.microsoft.com/office/word/2020/wordml/sdtdatahash" xmlns:w16sdtfl="http://schemas.microsoft.com/office/word/2024/wordml/sdtformatlock" xmlns:w16se="http://schemas.microsoft.com/office/word/2015/wordml/symex" xmlns:wpg="http://schemas.microsoft.com/office/word/2010/wordprocessingGroup" xmlns:wpi="http://schemas.microsoft.com/office/word/2010/wordprocessingInk" xmlns:wne="http://schemas.microsoft.com/office/word/2006/wordml" xmlns:wps="http://schemas.microsoft.com/office/word/2010/wordprocessingShape" mc:Ignorable="w14 w15 w16se w16cid w16 w16cex w16sdtdh w16sdtfl w16du wp14">
-  <w:comment w:id="19" w:author="Jonathan Melke" w:initials="JM" w:date="2026-07-08T23:13:00Z">
+  <w:comment w:id="19" w:author="Ben Editor" w:initials="JM" w:date="2026-07-08T23:13:00Z">
     <w:p>
       <w:r>
         <w:rPr>
@@ -4294,7 +4294,7 @@
 
 <file path=word/people.xml><?xml version="1.0" encoding="utf-8"?>
 <w15:people xmlns:wpc="http://schemas.microsoft.com/office/word/2010/wordprocessingCanvas" xmlns:cx="http://schemas.microsoft.com/office/drawing/2014/chartex" xmlns:cx1="http://schemas.microsoft.com/office/drawing/2015/9/8/chartex" xmlns:cx2="http://schemas.microsoft.com/office/drawing/2015/10/21/chartex" xmlns:cx3="http://schemas.microsoft.com/office/drawing/2016/5/9/chartex" xmlns:cx4="http://schemas.microsoft.com/office/drawing/2016/5/10/chartex" xmlns:cx5="http://schemas.microsoft.com/office/drawing/2016/5/11/chartex" xmlns:cx6="http://schemas.microsoft.com/office/drawing/2016/5/12/chartex" xmlns:cx7="http://schemas.microsoft.com/office/drawing/2016/5/13/chartex" xmlns:cx8="http://schemas.microsoft.com/office/drawing/2016/5/14/chartex" xmlns:mc="http://schemas.openxmlformats.org/markup-compatibility/2006" xmlns:m="http://schemas.openxmlformats.org/officeDocument/2006/math" xmlns:aink="http://schemas.microsoft.com/office/drawing/2016/ink" xmlns:am3d="http://schemas.microsoft.com/office/drawing/2017/model3d" xmlns:oel="http://schemas.microsoft.com/office/2019/extlst" xmlns:r="http://schemas.openxmlformats.org/officeDocument/2006/relationships" xmlns:wp14="http://schemas.microsoft.com/office/word/2010/wordprocessingDrawing" xmlns:wp="http://schemas.openxmlformats.org/drawingml/2006/wordprocessingDrawing" xmlns:wpg="http://schemas.microsoft.com/office/word/2010/wordprocessingGroup" xmlns:wpi="http://schemas.microsoft.com/office/word/2010/wordprocessingInk" xmlns:wps="http://schemas.microsoft.com/office/word/2010/wordprocessingShape" xmlns:o="urn:schemas-microsoft-com:office:office" xmlns:v="urn:schemas-microsoft-com:vml" xmlns:w10="urn:schemas-microsoft-com:office:word" xmlns:w="http://schemas.openxmlformats.org/wordprocessingml/2006/main" xmlns:w14="http://schemas.microsoft.com/office/word/2010/wordml" xmlns:w15="http://schemas.microsoft.com/office/word/2012/wordml" xmlns:w16cex="http://schemas.microsoft.com/office/word/2018/wordml/cex" xmlns:w16cid="http://schemas.microsoft.com/office/word/2016/wordml/cid" xmlns:w16="http://schemas.microsoft.com/office/word/2018/wordml" xmlns:w16sdtdh="http://schemas.microsoft.com/office/word/2020/wordml/sdtdatahash" xmlns:w16sdtfl="http://schemas.microsoft.com/office/word/2024/wordml/sdtformatlock" xmlns:w16se="http://schemas.microsoft.com/office/word/2015/wordml/symex" xmlns:w16du="http://schemas.microsoft.com/office/word/2023/wordml/word16du" xmlns:wne="http://schemas.microsoft.com/office/word/2006/wordml" mc:Ignorable="w14 w15 w16se w16cid w16 w16cex w16sdtdh w16sdtfl w16du wp14">
-  <w15:person w15:author="Jonathan Melke">
+  <w15:person w15:author="Ben Editor">
     <w15:presenceInfo w15:providerId="AD" w15:userId="S::jonathan.melke@legora.com::91a8e471-a737-49c6-bc56-620315841c82"/>
   </w15:person>
 </w15:people>

</xml_diff>